<commit_message>
relatorio com template do gemini
</commit_message>
<xml_diff>
--- a/Relatório Assignment #1.docx
+++ b/Relatório Assignment #1.docx
@@ -77,6 +77,56 @@
           <w:szCs w:val="32"/>
         </w:rPr>
       </w:pPr>
+    </w:p>
+    <w:p>
+      <w:pPr>
+        <w:jc w:val="center"/>
+        <w:rPr>
+          <w:rFonts w:ascii="Times New Roman" w:hAnsi="Times New Roman" w:cs="Times New Roman"/>
+          <w:sz w:val="32"/>
+          <w:szCs w:val="32"/>
+        </w:rPr>
+      </w:pPr>
+    </w:p>
+    <w:p>
+      <w:pPr>
+        <w:jc w:val="center"/>
+        <w:rPr>
+          <w:rFonts w:ascii="Times New Roman" w:hAnsi="Times New Roman" w:cs="Times New Roman"/>
+          <w:sz w:val="32"/>
+          <w:szCs w:val="32"/>
+        </w:rPr>
+      </w:pPr>
+    </w:p>
+    <w:p>
+      <w:pPr>
+        <w:jc w:val="center"/>
+        <w:rPr>
+          <w:rFonts w:ascii="Times New Roman" w:hAnsi="Times New Roman" w:cs="Times New Roman"/>
+          <w:sz w:val="32"/>
+          <w:szCs w:val="32"/>
+        </w:rPr>
+      </w:pPr>
+    </w:p>
+    <w:p>
+      <w:pPr>
+        <w:jc w:val="center"/>
+        <w:rPr>
+          <w:rFonts w:ascii="Times New Roman" w:hAnsi="Times New Roman" w:cs="Times New Roman"/>
+          <w:sz w:val="32"/>
+          <w:szCs w:val="32"/>
+        </w:rPr>
+      </w:pPr>
+    </w:p>
+    <w:p>
+      <w:pPr>
+        <w:jc w:val="center"/>
+        <w:rPr>
+          <w:rFonts w:ascii="Times New Roman" w:hAnsi="Times New Roman" w:cs="Times New Roman"/>
+          <w:sz w:val="32"/>
+          <w:szCs w:val="32"/>
+        </w:rPr>
+      </w:pPr>
       <w:r>
         <w:rPr>
           <w:rFonts w:ascii="Times New Roman" w:hAnsi="Times New Roman" w:cs="Times New Roman"/>
@@ -199,6 +249,1641 @@
           <w:szCs w:val="32"/>
         </w:rPr>
       </w:pPr>
+    </w:p>
+    <w:p>
+      <w:pPr>
+        <w:ind w:firstLine="708"/>
+        <w:rPr>
+          <w:rFonts w:ascii="Times New Roman" w:hAnsi="Times New Roman" w:cs="Times New Roman"/>
+          <w:sz w:val="32"/>
+          <w:szCs w:val="32"/>
+        </w:rPr>
+      </w:pPr>
+    </w:p>
+    <w:p>
+      <w:pPr>
+        <w:rPr>
+          <w:rFonts w:ascii="Times New Roman" w:hAnsi="Times New Roman" w:cs="Times New Roman"/>
+          <w:sz w:val="32"/>
+          <w:szCs w:val="32"/>
+        </w:rPr>
+      </w:pPr>
+      <w:r>
+        <w:rPr>
+          <w:noProof/>
+        </w:rPr>
+        <w:drawing>
+          <wp:anchor distT="0" distB="0" distL="114300" distR="114300" simplePos="0" relativeHeight="251658240" behindDoc="1" locked="0" layoutInCell="1" allowOverlap="1" wp14:anchorId="34F67111" wp14:editId="06A05302">
+            <wp:simplePos x="0" y="0"/>
+            <wp:positionH relativeFrom="column">
+              <wp:posOffset>5029200</wp:posOffset>
+            </wp:positionH>
+            <wp:positionV relativeFrom="page">
+              <wp:posOffset>9467850</wp:posOffset>
+            </wp:positionV>
+            <wp:extent cx="1581785" cy="1160145"/>
+            <wp:effectExtent l="0" t="0" r="0" b="1905"/>
+            <wp:wrapNone/>
+            <wp:docPr id="1346797728" name="Picture 1" descr="A logo with text and a picture of a person&#10;&#10;Description automatically generated"/>
+            <wp:cNvGraphicFramePr>
+              <a:graphicFrameLocks xmlns:a="http://schemas.openxmlformats.org/drawingml/2006/main" noChangeAspect="1"/>
+            </wp:cNvGraphicFramePr>
+            <a:graphic xmlns:a="http://schemas.openxmlformats.org/drawingml/2006/main">
+              <a:graphicData uri="http://schemas.openxmlformats.org/drawingml/2006/picture">
+                <pic:pic xmlns:pic="http://schemas.openxmlformats.org/drawingml/2006/picture">
+                  <pic:nvPicPr>
+                    <pic:cNvPr id="1346797728" name="Picture 1" descr="A logo with text and a picture of a person&#10;&#10;Description automatically generated"/>
+                    <pic:cNvPicPr/>
+                  </pic:nvPicPr>
+                  <pic:blipFill>
+                    <a:blip r:embed="rId4">
+                      <a:extLst>
+                        <a:ext uri="{28A0092B-C50C-407E-A947-70E740481C1C}">
+                          <a14:useLocalDpi xmlns:a14="http://schemas.microsoft.com/office/drawing/2010/main" val="0"/>
+                        </a:ext>
+                      </a:extLst>
+                    </a:blip>
+                    <a:stretch>
+                      <a:fillRect/>
+                    </a:stretch>
+                  </pic:blipFill>
+                  <pic:spPr>
+                    <a:xfrm>
+                      <a:off x="0" y="0"/>
+                      <a:ext cx="1581785" cy="1160145"/>
+                    </a:xfrm>
+                    <a:prstGeom prst="rect">
+                      <a:avLst/>
+                    </a:prstGeom>
+                  </pic:spPr>
+                </pic:pic>
+              </a:graphicData>
+            </a:graphic>
+          </wp:anchor>
+        </w:drawing>
+      </w:r>
+      <w:r>
+        <w:rPr>
+          <w:rFonts w:ascii="Times New Roman" w:hAnsi="Times New Roman" w:cs="Times New Roman"/>
+          <w:sz w:val="32"/>
+          <w:szCs w:val="32"/>
+        </w:rPr>
+        <w:br w:type="page"/>
+      </w:r>
+    </w:p>
+    <w:p>
+      <w:pPr>
+        <w:spacing w:before="100" w:beforeAutospacing="1" w:after="100" w:afterAutospacing="1" w:line="240" w:lineRule="auto"/>
+        <w:outlineLvl w:val="1"/>
+        <w:rPr>
+          <w:rFonts w:ascii="Times New Roman" w:eastAsia="Times New Roman" w:hAnsi="Times New Roman" w:cs="Times New Roman"/>
+          <w:b/>
+          <w:bCs/>
+          <w:kern w:val="0"/>
+          <w:sz w:val="36"/>
+          <w:szCs w:val="36"/>
+          <w:lang w:eastAsia="pt-PT"/>
+          <w14:ligatures w14:val="none"/>
+        </w:rPr>
+      </w:pPr>
+      <w:r>
+        <w:rPr>
+          <w:rFonts w:ascii="Times New Roman" w:eastAsia="Times New Roman" w:hAnsi="Times New Roman" w:cs="Times New Roman"/>
+          <w:b/>
+          <w:bCs/>
+          <w:kern w:val="0"/>
+          <w:sz w:val="36"/>
+          <w:szCs w:val="36"/>
+          <w:lang w:eastAsia="pt-PT"/>
+          <w14:ligatures w14:val="none"/>
+        </w:rPr>
+        <w:lastRenderedPageBreak/>
+        <w:t>1. Descrição das Configurações e Implementação da Arquitetura</w:t>
+      </w:r>
+    </w:p>
+    <w:p>
+      <w:pPr>
+        <w:spacing w:before="100" w:beforeAutospacing="1" w:after="100" w:afterAutospacing="1" w:line="240" w:lineRule="auto"/>
+        <w:rPr>
+          <w:rFonts w:ascii="Times New Roman" w:eastAsia="Times New Roman" w:hAnsi="Times New Roman" w:cs="Times New Roman"/>
+          <w:kern w:val="0"/>
+          <w:lang w:eastAsia="pt-PT"/>
+          <w14:ligatures w14:val="none"/>
+        </w:rPr>
+      </w:pPr>
+      <w:r>
+        <w:rPr>
+          <w:rFonts w:ascii="Times New Roman" w:eastAsia="Times New Roman" w:hAnsi="Times New Roman" w:cs="Times New Roman"/>
+          <w:kern w:val="0"/>
+          <w:lang w:eastAsia="pt-PT"/>
+          <w14:ligatures w14:val="none"/>
+        </w:rPr>
+        <w:t xml:space="preserve">A infraestrutura laboratorial foi construída sobre o </w:t>
+      </w:r>
+      <w:proofErr w:type="spellStart"/>
+      <w:r>
+        <w:rPr>
+          <w:rFonts w:ascii="Times New Roman" w:eastAsia="Times New Roman" w:hAnsi="Times New Roman" w:cs="Times New Roman"/>
+          <w:kern w:val="0"/>
+          <w:lang w:eastAsia="pt-PT"/>
+          <w14:ligatures w14:val="none"/>
+        </w:rPr>
+        <w:t>hypervisor</w:t>
+      </w:r>
+      <w:proofErr w:type="spellEnd"/>
+      <w:r>
+        <w:rPr>
+          <w:rFonts w:ascii="Times New Roman" w:eastAsia="Times New Roman" w:hAnsi="Times New Roman" w:cs="Times New Roman"/>
+          <w:kern w:val="0"/>
+          <w:lang w:eastAsia="pt-PT"/>
+          <w14:ligatures w14:val="none"/>
+        </w:rPr>
+        <w:t xml:space="preserve"> </w:t>
+      </w:r>
+      <w:proofErr w:type="spellStart"/>
+      <w:r>
+        <w:rPr>
+          <w:rFonts w:ascii="Times New Roman" w:eastAsia="Times New Roman" w:hAnsi="Times New Roman" w:cs="Times New Roman"/>
+          <w:kern w:val="0"/>
+          <w:lang w:eastAsia="pt-PT"/>
+          <w14:ligatures w14:val="none"/>
+        </w:rPr>
+        <w:t>VMware</w:t>
+      </w:r>
+      <w:proofErr w:type="spellEnd"/>
+      <w:r>
+        <w:rPr>
+          <w:rFonts w:ascii="Times New Roman" w:eastAsia="Times New Roman" w:hAnsi="Times New Roman" w:cs="Times New Roman"/>
+          <w:kern w:val="0"/>
+          <w:lang w:eastAsia="pt-PT"/>
+          <w14:ligatures w14:val="none"/>
+        </w:rPr>
+        <w:t xml:space="preserve">, utilizando a funcionalidade de "LAN </w:t>
+      </w:r>
+      <w:proofErr w:type="spellStart"/>
+      <w:r>
+        <w:rPr>
+          <w:rFonts w:ascii="Times New Roman" w:eastAsia="Times New Roman" w:hAnsi="Times New Roman" w:cs="Times New Roman"/>
+          <w:kern w:val="0"/>
+          <w:lang w:eastAsia="pt-PT"/>
+          <w14:ligatures w14:val="none"/>
+        </w:rPr>
+        <w:t>Segments</w:t>
+      </w:r>
+      <w:proofErr w:type="spellEnd"/>
+      <w:r>
+        <w:rPr>
+          <w:rFonts w:ascii="Times New Roman" w:eastAsia="Times New Roman" w:hAnsi="Times New Roman" w:cs="Times New Roman"/>
+          <w:kern w:val="0"/>
+          <w:lang w:eastAsia="pt-PT"/>
+          <w14:ligatures w14:val="none"/>
+        </w:rPr>
+        <w:t xml:space="preserve">" para garantir o isolamento físico virtual das redes e evitar interferências com o exterior. A topologia baseou-se numa máquina </w:t>
+      </w:r>
+      <w:proofErr w:type="spellStart"/>
+      <w:r>
+        <w:rPr>
+          <w:rFonts w:ascii="Times New Roman" w:eastAsia="Times New Roman" w:hAnsi="Times New Roman" w:cs="Times New Roman"/>
+          <w:kern w:val="0"/>
+          <w:lang w:eastAsia="pt-PT"/>
+          <w14:ligatures w14:val="none"/>
+        </w:rPr>
+        <w:t>CentOS</w:t>
+      </w:r>
+      <w:proofErr w:type="spellEnd"/>
+      <w:r>
+        <w:rPr>
+          <w:rFonts w:ascii="Times New Roman" w:eastAsia="Times New Roman" w:hAnsi="Times New Roman" w:cs="Times New Roman"/>
+          <w:kern w:val="0"/>
+          <w:lang w:eastAsia="pt-PT"/>
+          <w14:ligatures w14:val="none"/>
+        </w:rPr>
+        <w:t xml:space="preserve"> 9 </w:t>
+      </w:r>
+      <w:proofErr w:type="spellStart"/>
+      <w:r>
+        <w:rPr>
+          <w:rFonts w:ascii="Times New Roman" w:eastAsia="Times New Roman" w:hAnsi="Times New Roman" w:cs="Times New Roman"/>
+          <w:kern w:val="0"/>
+          <w:lang w:eastAsia="pt-PT"/>
+          <w14:ligatures w14:val="none"/>
+        </w:rPr>
+        <w:t>Stream</w:t>
+      </w:r>
+      <w:proofErr w:type="spellEnd"/>
+      <w:r>
+        <w:rPr>
+          <w:rFonts w:ascii="Times New Roman" w:eastAsia="Times New Roman" w:hAnsi="Times New Roman" w:cs="Times New Roman"/>
+          <w:kern w:val="0"/>
+          <w:lang w:eastAsia="pt-PT"/>
+          <w14:ligatures w14:val="none"/>
+        </w:rPr>
+        <w:t xml:space="preserve"> a atuar como Router e Firewall central, equipada com múltiplas interfaces de rede. A interface externa (</w:t>
+      </w:r>
+      <w:r>
+        <w:rPr>
+          <w:rFonts w:ascii="Courier New" w:eastAsia="Times New Roman" w:hAnsi="Courier New" w:cs="Courier New"/>
+          <w:kern w:val="0"/>
+          <w:sz w:val="20"/>
+          <w:szCs w:val="20"/>
+          <w:lang w:eastAsia="pt-PT"/>
+          <w14:ligatures w14:val="none"/>
+        </w:rPr>
+        <w:t>ens33</w:t>
+      </w:r>
+      <w:r>
+        <w:rPr>
+          <w:rFonts w:ascii="Times New Roman" w:eastAsia="Times New Roman" w:hAnsi="Times New Roman" w:cs="Times New Roman"/>
+          <w:kern w:val="0"/>
+          <w:lang w:eastAsia="pt-PT"/>
+          <w14:ligatures w14:val="none"/>
+        </w:rPr>
+        <w:t xml:space="preserve">) foi configurada em modo NAT para garantir acesso à Internet, obtendo o endereço estático 192.168.150.134. Para a rede interna, estabelecida no endereçamento </w:t>
+      </w:r>
+      <w:r>
+        <w:rPr>
+          <w:rFonts w:ascii="Courier New" w:eastAsia="Times New Roman" w:hAnsi="Courier New" w:cs="Courier New"/>
+          <w:kern w:val="0"/>
+          <w:sz w:val="20"/>
+          <w:szCs w:val="20"/>
+          <w:lang w:eastAsia="pt-PT"/>
+          <w14:ligatures w14:val="none"/>
+        </w:rPr>
+        <w:t>10.10.10.0/24</w:t>
+      </w:r>
+      <w:r>
+        <w:rPr>
+          <w:rFonts w:ascii="Times New Roman" w:eastAsia="Times New Roman" w:hAnsi="Times New Roman" w:cs="Times New Roman"/>
+          <w:kern w:val="0"/>
+          <w:lang w:eastAsia="pt-PT"/>
+          <w14:ligatures w14:val="none"/>
+        </w:rPr>
+        <w:t>, a interface do Router (</w:t>
+      </w:r>
+      <w:r>
+        <w:rPr>
+          <w:rFonts w:ascii="Courier New" w:eastAsia="Times New Roman" w:hAnsi="Courier New" w:cs="Courier New"/>
+          <w:kern w:val="0"/>
+          <w:sz w:val="20"/>
+          <w:szCs w:val="20"/>
+          <w:lang w:eastAsia="pt-PT"/>
+          <w14:ligatures w14:val="none"/>
+        </w:rPr>
+        <w:t>ens37</w:t>
+      </w:r>
+      <w:r>
+        <w:rPr>
+          <w:rFonts w:ascii="Times New Roman" w:eastAsia="Times New Roman" w:hAnsi="Times New Roman" w:cs="Times New Roman"/>
+          <w:kern w:val="0"/>
+          <w:lang w:eastAsia="pt-PT"/>
+          <w14:ligatures w14:val="none"/>
+        </w:rPr>
+        <w:t xml:space="preserve">) assumiu o IP 10.10.10.1. A máquina cliente (VM2, a ser utilizada nos testes de intrusão) foi configurada com o IP 10.10.10.2, definindo-se o Router como o seu Gateway predefinido através do utilitário </w:t>
+      </w:r>
+      <w:proofErr w:type="spellStart"/>
+      <w:r>
+        <w:rPr>
+          <w:rFonts w:ascii="Courier New" w:eastAsia="Times New Roman" w:hAnsi="Courier New" w:cs="Courier New"/>
+          <w:kern w:val="0"/>
+          <w:sz w:val="20"/>
+          <w:szCs w:val="20"/>
+          <w:lang w:eastAsia="pt-PT"/>
+          <w14:ligatures w14:val="none"/>
+        </w:rPr>
+        <w:t>nmcli</w:t>
+      </w:r>
+      <w:proofErr w:type="spellEnd"/>
+      <w:r>
+        <w:rPr>
+          <w:rFonts w:ascii="Times New Roman" w:eastAsia="Times New Roman" w:hAnsi="Times New Roman" w:cs="Times New Roman"/>
+          <w:kern w:val="0"/>
+          <w:lang w:eastAsia="pt-PT"/>
+          <w14:ligatures w14:val="none"/>
+        </w:rPr>
+        <w:t xml:space="preserve">. Durante esta fase inicial de construção da rede, enfrentámos desafios de </w:t>
+      </w:r>
+      <w:proofErr w:type="spellStart"/>
+      <w:r>
+        <w:rPr>
+          <w:rFonts w:ascii="Times New Roman" w:eastAsia="Times New Roman" w:hAnsi="Times New Roman" w:cs="Times New Roman"/>
+          <w:kern w:val="0"/>
+          <w:lang w:eastAsia="pt-PT"/>
+          <w14:ligatures w14:val="none"/>
+        </w:rPr>
+        <w:t>Layer</w:t>
+      </w:r>
+      <w:proofErr w:type="spellEnd"/>
+      <w:r>
+        <w:rPr>
+          <w:rFonts w:ascii="Times New Roman" w:eastAsia="Times New Roman" w:hAnsi="Times New Roman" w:cs="Times New Roman"/>
+          <w:kern w:val="0"/>
+          <w:lang w:eastAsia="pt-PT"/>
+          <w14:ligatures w14:val="none"/>
+        </w:rPr>
+        <w:t xml:space="preserve"> 2 que resultavam em perda total de pacotes (erro de </w:t>
+      </w:r>
+      <w:proofErr w:type="spellStart"/>
+      <w:r>
+        <w:rPr>
+          <w:rFonts w:ascii="Times New Roman" w:eastAsia="Times New Roman" w:hAnsi="Times New Roman" w:cs="Times New Roman"/>
+          <w:i/>
+          <w:iCs/>
+          <w:kern w:val="0"/>
+          <w:lang w:eastAsia="pt-PT"/>
+          <w14:ligatures w14:val="none"/>
+        </w:rPr>
+        <w:t>Destination</w:t>
+      </w:r>
+      <w:proofErr w:type="spellEnd"/>
+      <w:r>
+        <w:rPr>
+          <w:rFonts w:ascii="Times New Roman" w:eastAsia="Times New Roman" w:hAnsi="Times New Roman" w:cs="Times New Roman"/>
+          <w:i/>
+          <w:iCs/>
+          <w:kern w:val="0"/>
+          <w:lang w:eastAsia="pt-PT"/>
+          <w14:ligatures w14:val="none"/>
+        </w:rPr>
+        <w:t xml:space="preserve"> </w:t>
+      </w:r>
+      <w:proofErr w:type="spellStart"/>
+      <w:r>
+        <w:rPr>
+          <w:rFonts w:ascii="Times New Roman" w:eastAsia="Times New Roman" w:hAnsi="Times New Roman" w:cs="Times New Roman"/>
+          <w:i/>
+          <w:iCs/>
+          <w:kern w:val="0"/>
+          <w:lang w:eastAsia="pt-PT"/>
+          <w14:ligatures w14:val="none"/>
+        </w:rPr>
+        <w:t>Host</w:t>
+      </w:r>
+      <w:proofErr w:type="spellEnd"/>
+      <w:r>
+        <w:rPr>
+          <w:rFonts w:ascii="Times New Roman" w:eastAsia="Times New Roman" w:hAnsi="Times New Roman" w:cs="Times New Roman"/>
+          <w:i/>
+          <w:iCs/>
+          <w:kern w:val="0"/>
+          <w:lang w:eastAsia="pt-PT"/>
+          <w14:ligatures w14:val="none"/>
+        </w:rPr>
+        <w:t xml:space="preserve"> </w:t>
+      </w:r>
+      <w:proofErr w:type="spellStart"/>
+      <w:r>
+        <w:rPr>
+          <w:rFonts w:ascii="Times New Roman" w:eastAsia="Times New Roman" w:hAnsi="Times New Roman" w:cs="Times New Roman"/>
+          <w:i/>
+          <w:iCs/>
+          <w:kern w:val="0"/>
+          <w:lang w:eastAsia="pt-PT"/>
+          <w14:ligatures w14:val="none"/>
+        </w:rPr>
+        <w:t>Unreachable</w:t>
+      </w:r>
+      <w:proofErr w:type="spellEnd"/>
+      <w:r>
+        <w:rPr>
+          <w:rFonts w:ascii="Times New Roman" w:eastAsia="Times New Roman" w:hAnsi="Times New Roman" w:cs="Times New Roman"/>
+          <w:kern w:val="0"/>
+          <w:lang w:eastAsia="pt-PT"/>
+          <w14:ligatures w14:val="none"/>
+        </w:rPr>
+        <w:t xml:space="preserve">), situação que foi rapidamente diagnosticada e resolvida através da reatribuição e reinício das ligações virtuais dos adaptadores no </w:t>
+      </w:r>
+      <w:proofErr w:type="spellStart"/>
+      <w:r>
+        <w:rPr>
+          <w:rFonts w:ascii="Times New Roman" w:eastAsia="Times New Roman" w:hAnsi="Times New Roman" w:cs="Times New Roman"/>
+          <w:kern w:val="0"/>
+          <w:lang w:eastAsia="pt-PT"/>
+          <w14:ligatures w14:val="none"/>
+        </w:rPr>
+        <w:t>VMware</w:t>
+      </w:r>
+      <w:proofErr w:type="spellEnd"/>
+      <w:r>
+        <w:rPr>
+          <w:rFonts w:ascii="Times New Roman" w:eastAsia="Times New Roman" w:hAnsi="Times New Roman" w:cs="Times New Roman"/>
+          <w:kern w:val="0"/>
+          <w:lang w:eastAsia="pt-PT"/>
+          <w14:ligatures w14:val="none"/>
+        </w:rPr>
+        <w:t>.</w:t>
+      </w:r>
+    </w:p>
+    <w:p>
+      <w:pPr>
+        <w:spacing w:before="100" w:beforeAutospacing="1" w:after="100" w:afterAutospacing="1" w:line="240" w:lineRule="auto"/>
+        <w:rPr>
+          <w:rFonts w:ascii="Times New Roman" w:eastAsia="Times New Roman" w:hAnsi="Times New Roman" w:cs="Times New Roman"/>
+          <w:kern w:val="0"/>
+          <w:lang w:eastAsia="pt-PT"/>
+          <w14:ligatures w14:val="none"/>
+        </w:rPr>
+      </w:pPr>
+      <w:r>
+        <w:rPr>
+          <w:rFonts w:ascii="Times New Roman" w:eastAsia="Times New Roman" w:hAnsi="Times New Roman" w:cs="Times New Roman"/>
+          <w:kern w:val="0"/>
+          <w:lang w:eastAsia="pt-PT"/>
+          <w14:ligatures w14:val="none"/>
+        </w:rPr>
+        <w:t xml:space="preserve">Com a rede física virtual estabelecida, o roteamento de pacotes foi ativado no </w:t>
+      </w:r>
+      <w:proofErr w:type="spellStart"/>
+      <w:r>
+        <w:rPr>
+          <w:rFonts w:ascii="Times New Roman" w:eastAsia="Times New Roman" w:hAnsi="Times New Roman" w:cs="Times New Roman"/>
+          <w:i/>
+          <w:iCs/>
+          <w:kern w:val="0"/>
+          <w:lang w:eastAsia="pt-PT"/>
+          <w14:ligatures w14:val="none"/>
+        </w:rPr>
+        <w:t>kernel</w:t>
+      </w:r>
+      <w:proofErr w:type="spellEnd"/>
+      <w:r>
+        <w:rPr>
+          <w:rFonts w:ascii="Times New Roman" w:eastAsia="Times New Roman" w:hAnsi="Times New Roman" w:cs="Times New Roman"/>
+          <w:kern w:val="0"/>
+          <w:lang w:eastAsia="pt-PT"/>
+          <w14:ligatures w14:val="none"/>
+        </w:rPr>
+        <w:t xml:space="preserve"> do Linux (IP </w:t>
+      </w:r>
+      <w:proofErr w:type="spellStart"/>
+      <w:r>
+        <w:rPr>
+          <w:rFonts w:ascii="Times New Roman" w:eastAsia="Times New Roman" w:hAnsi="Times New Roman" w:cs="Times New Roman"/>
+          <w:kern w:val="0"/>
+          <w:lang w:eastAsia="pt-PT"/>
+          <w14:ligatures w14:val="none"/>
+        </w:rPr>
+        <w:t>Forwarding</w:t>
+      </w:r>
+      <w:proofErr w:type="spellEnd"/>
+      <w:r>
+        <w:rPr>
+          <w:rFonts w:ascii="Times New Roman" w:eastAsia="Times New Roman" w:hAnsi="Times New Roman" w:cs="Times New Roman"/>
+          <w:kern w:val="0"/>
+          <w:lang w:eastAsia="pt-PT"/>
+          <w14:ligatures w14:val="none"/>
+        </w:rPr>
+        <w:t xml:space="preserve">) e a arquitetura de segurança foi implementada através de um script automatizado de </w:t>
+      </w:r>
+      <w:proofErr w:type="spellStart"/>
+      <w:r>
+        <w:rPr>
+          <w:rFonts w:ascii="Times New Roman" w:eastAsia="Times New Roman" w:hAnsi="Times New Roman" w:cs="Times New Roman"/>
+          <w:kern w:val="0"/>
+          <w:lang w:eastAsia="pt-PT"/>
+          <w14:ligatures w14:val="none"/>
+        </w:rPr>
+        <w:t>Bash</w:t>
+      </w:r>
+      <w:proofErr w:type="spellEnd"/>
+      <w:r>
+        <w:rPr>
+          <w:rFonts w:ascii="Times New Roman" w:eastAsia="Times New Roman" w:hAnsi="Times New Roman" w:cs="Times New Roman"/>
+          <w:kern w:val="0"/>
+          <w:lang w:eastAsia="pt-PT"/>
+          <w14:ligatures w14:val="none"/>
+        </w:rPr>
+        <w:t xml:space="preserve"> (</w:t>
+      </w:r>
+      <w:r>
+        <w:rPr>
+          <w:rFonts w:ascii="Courier New" w:eastAsia="Times New Roman" w:hAnsi="Courier New" w:cs="Courier New"/>
+          <w:kern w:val="0"/>
+          <w:sz w:val="20"/>
+          <w:szCs w:val="20"/>
+          <w:lang w:eastAsia="pt-PT"/>
+          <w14:ligatures w14:val="none"/>
+        </w:rPr>
+        <w:t>firewall.sh</w:t>
+      </w:r>
+      <w:r>
+        <w:rPr>
+          <w:rFonts w:ascii="Times New Roman" w:eastAsia="Times New Roman" w:hAnsi="Times New Roman" w:cs="Times New Roman"/>
+          <w:kern w:val="0"/>
+          <w:lang w:eastAsia="pt-PT"/>
+          <w14:ligatures w14:val="none"/>
+        </w:rPr>
+        <w:t>). A firewall foi desenhada com base numa filosofia de segurança máxima (</w:t>
+      </w:r>
+      <w:proofErr w:type="spellStart"/>
+      <w:r>
+        <w:rPr>
+          <w:rFonts w:ascii="Times New Roman" w:eastAsia="Times New Roman" w:hAnsi="Times New Roman" w:cs="Times New Roman"/>
+          <w:i/>
+          <w:iCs/>
+          <w:kern w:val="0"/>
+          <w:lang w:eastAsia="pt-PT"/>
+          <w14:ligatures w14:val="none"/>
+        </w:rPr>
+        <w:t>default-deny</w:t>
+      </w:r>
+      <w:proofErr w:type="spellEnd"/>
+      <w:r>
+        <w:rPr>
+          <w:rFonts w:ascii="Times New Roman" w:eastAsia="Times New Roman" w:hAnsi="Times New Roman" w:cs="Times New Roman"/>
+          <w:kern w:val="0"/>
+          <w:lang w:eastAsia="pt-PT"/>
+          <w14:ligatures w14:val="none"/>
+        </w:rPr>
+        <w:t xml:space="preserve">), aplicando a política </w:t>
+      </w:r>
+      <w:r>
+        <w:rPr>
+          <w:rFonts w:ascii="Courier New" w:eastAsia="Times New Roman" w:hAnsi="Courier New" w:cs="Courier New"/>
+          <w:kern w:val="0"/>
+          <w:sz w:val="20"/>
+          <w:szCs w:val="20"/>
+          <w:lang w:eastAsia="pt-PT"/>
+          <w14:ligatures w14:val="none"/>
+        </w:rPr>
+        <w:t>DROP</w:t>
+      </w:r>
+      <w:r>
+        <w:rPr>
+          <w:rFonts w:ascii="Times New Roman" w:eastAsia="Times New Roman" w:hAnsi="Times New Roman" w:cs="Times New Roman"/>
+          <w:kern w:val="0"/>
+          <w:lang w:eastAsia="pt-PT"/>
+          <w14:ligatures w14:val="none"/>
+        </w:rPr>
+        <w:t xml:space="preserve"> nas </w:t>
+      </w:r>
+      <w:proofErr w:type="spellStart"/>
+      <w:r>
+        <w:rPr>
+          <w:rFonts w:ascii="Times New Roman" w:eastAsia="Times New Roman" w:hAnsi="Times New Roman" w:cs="Times New Roman"/>
+          <w:i/>
+          <w:iCs/>
+          <w:kern w:val="0"/>
+          <w:lang w:eastAsia="pt-PT"/>
+          <w14:ligatures w14:val="none"/>
+        </w:rPr>
+        <w:t>chains</w:t>
+      </w:r>
+      <w:proofErr w:type="spellEnd"/>
+      <w:r>
+        <w:rPr>
+          <w:rFonts w:ascii="Times New Roman" w:eastAsia="Times New Roman" w:hAnsi="Times New Roman" w:cs="Times New Roman"/>
+          <w:kern w:val="0"/>
+          <w:lang w:eastAsia="pt-PT"/>
+          <w14:ligatures w14:val="none"/>
+        </w:rPr>
+        <w:t xml:space="preserve"> genéricas </w:t>
+      </w:r>
+      <w:r>
+        <w:rPr>
+          <w:rFonts w:ascii="Courier New" w:eastAsia="Times New Roman" w:hAnsi="Courier New" w:cs="Courier New"/>
+          <w:kern w:val="0"/>
+          <w:sz w:val="20"/>
+          <w:szCs w:val="20"/>
+          <w:lang w:eastAsia="pt-PT"/>
+          <w14:ligatures w14:val="none"/>
+        </w:rPr>
+        <w:t>INPUT</w:t>
+      </w:r>
+      <w:r>
+        <w:rPr>
+          <w:rFonts w:ascii="Times New Roman" w:eastAsia="Times New Roman" w:hAnsi="Times New Roman" w:cs="Times New Roman"/>
+          <w:kern w:val="0"/>
+          <w:lang w:eastAsia="pt-PT"/>
+          <w14:ligatures w14:val="none"/>
+        </w:rPr>
+        <w:t xml:space="preserve">, </w:t>
+      </w:r>
+      <w:r>
+        <w:rPr>
+          <w:rFonts w:ascii="Courier New" w:eastAsia="Times New Roman" w:hAnsi="Courier New" w:cs="Courier New"/>
+          <w:kern w:val="0"/>
+          <w:sz w:val="20"/>
+          <w:szCs w:val="20"/>
+          <w:lang w:eastAsia="pt-PT"/>
+          <w14:ligatures w14:val="none"/>
+        </w:rPr>
+        <w:t>FORWARD</w:t>
+      </w:r>
+      <w:r>
+        <w:rPr>
+          <w:rFonts w:ascii="Times New Roman" w:eastAsia="Times New Roman" w:hAnsi="Times New Roman" w:cs="Times New Roman"/>
+          <w:kern w:val="0"/>
+          <w:lang w:eastAsia="pt-PT"/>
+          <w14:ligatures w14:val="none"/>
+        </w:rPr>
+        <w:t xml:space="preserve"> e </w:t>
+      </w:r>
+      <w:r>
+        <w:rPr>
+          <w:rFonts w:ascii="Courier New" w:eastAsia="Times New Roman" w:hAnsi="Courier New" w:cs="Courier New"/>
+          <w:kern w:val="0"/>
+          <w:sz w:val="20"/>
+          <w:szCs w:val="20"/>
+          <w:lang w:eastAsia="pt-PT"/>
+          <w14:ligatures w14:val="none"/>
+        </w:rPr>
+        <w:t>OUTPUT</w:t>
+      </w:r>
+      <w:r>
+        <w:rPr>
+          <w:rFonts w:ascii="Times New Roman" w:eastAsia="Times New Roman" w:hAnsi="Times New Roman" w:cs="Times New Roman"/>
+          <w:kern w:val="0"/>
+          <w:lang w:eastAsia="pt-PT"/>
+          <w14:ligatures w14:val="none"/>
+        </w:rPr>
+        <w:t xml:space="preserve">. Isto garante que apenas o tráfego explicitamente autorizado consiga atravessar o router. Para além do carregamento de módulos do </w:t>
+      </w:r>
+      <w:proofErr w:type="spellStart"/>
+      <w:r>
+        <w:rPr>
+          <w:rFonts w:ascii="Times New Roman" w:eastAsia="Times New Roman" w:hAnsi="Times New Roman" w:cs="Times New Roman"/>
+          <w:i/>
+          <w:iCs/>
+          <w:kern w:val="0"/>
+          <w:lang w:eastAsia="pt-PT"/>
+          <w14:ligatures w14:val="none"/>
+        </w:rPr>
+        <w:t>kernel</w:t>
+      </w:r>
+      <w:proofErr w:type="spellEnd"/>
+      <w:r>
+        <w:rPr>
+          <w:rFonts w:ascii="Times New Roman" w:eastAsia="Times New Roman" w:hAnsi="Times New Roman" w:cs="Times New Roman"/>
+          <w:kern w:val="0"/>
+          <w:lang w:eastAsia="pt-PT"/>
+          <w14:ligatures w14:val="none"/>
+        </w:rPr>
+        <w:t xml:space="preserve"> essenciais, como o </w:t>
+      </w:r>
+      <w:proofErr w:type="spellStart"/>
+      <w:r>
+        <w:rPr>
+          <w:rFonts w:ascii="Courier New" w:eastAsia="Times New Roman" w:hAnsi="Courier New" w:cs="Courier New"/>
+          <w:kern w:val="0"/>
+          <w:sz w:val="20"/>
+          <w:szCs w:val="20"/>
+          <w:lang w:eastAsia="pt-PT"/>
+          <w14:ligatures w14:val="none"/>
+        </w:rPr>
+        <w:t>nf_conntrack_ftp</w:t>
+      </w:r>
+      <w:proofErr w:type="spellEnd"/>
+      <w:r>
+        <w:rPr>
+          <w:rFonts w:ascii="Times New Roman" w:eastAsia="Times New Roman" w:hAnsi="Times New Roman" w:cs="Times New Roman"/>
+          <w:kern w:val="0"/>
+          <w:lang w:eastAsia="pt-PT"/>
+          <w14:ligatures w14:val="none"/>
+        </w:rPr>
+        <w:t xml:space="preserve"> para gerir o tráfego dinâmico das portas de FTP, implementámos regras </w:t>
+      </w:r>
+      <w:proofErr w:type="spellStart"/>
+      <w:r>
+        <w:rPr>
+          <w:rFonts w:ascii="Times New Roman" w:eastAsia="Times New Roman" w:hAnsi="Times New Roman" w:cs="Times New Roman"/>
+          <w:i/>
+          <w:iCs/>
+          <w:kern w:val="0"/>
+          <w:lang w:eastAsia="pt-PT"/>
+          <w14:ligatures w14:val="none"/>
+        </w:rPr>
+        <w:t>stateful</w:t>
+      </w:r>
+      <w:proofErr w:type="spellEnd"/>
+      <w:r>
+        <w:rPr>
+          <w:rFonts w:ascii="Times New Roman" w:eastAsia="Times New Roman" w:hAnsi="Times New Roman" w:cs="Times New Roman"/>
+          <w:kern w:val="0"/>
+          <w:lang w:eastAsia="pt-PT"/>
+          <w14:ligatures w14:val="none"/>
+        </w:rPr>
+        <w:t xml:space="preserve"> (</w:t>
+      </w:r>
+      <w:r>
+        <w:rPr>
+          <w:rFonts w:ascii="Courier New" w:eastAsia="Times New Roman" w:hAnsi="Courier New" w:cs="Courier New"/>
+          <w:kern w:val="0"/>
+          <w:sz w:val="20"/>
+          <w:szCs w:val="20"/>
+          <w:lang w:eastAsia="pt-PT"/>
+          <w14:ligatures w14:val="none"/>
+        </w:rPr>
+        <w:t>ESTABLISHED, RELATED</w:t>
+      </w:r>
+      <w:r>
+        <w:rPr>
+          <w:rFonts w:ascii="Times New Roman" w:eastAsia="Times New Roman" w:hAnsi="Times New Roman" w:cs="Times New Roman"/>
+          <w:kern w:val="0"/>
+          <w:lang w:eastAsia="pt-PT"/>
+          <w14:ligatures w14:val="none"/>
+        </w:rPr>
+        <w:t xml:space="preserve">) para otimizar o fluxo de conexões de retorno já validadas. Foram criadas exceções estritas no </w:t>
+      </w:r>
+      <w:r>
+        <w:rPr>
+          <w:rFonts w:ascii="Courier New" w:eastAsia="Times New Roman" w:hAnsi="Courier New" w:cs="Courier New"/>
+          <w:kern w:val="0"/>
+          <w:sz w:val="20"/>
+          <w:szCs w:val="20"/>
+          <w:lang w:eastAsia="pt-PT"/>
+          <w14:ligatures w14:val="none"/>
+        </w:rPr>
+        <w:t>FORWARD</w:t>
+      </w:r>
+      <w:r>
+        <w:rPr>
+          <w:rFonts w:ascii="Times New Roman" w:eastAsia="Times New Roman" w:hAnsi="Times New Roman" w:cs="Times New Roman"/>
+          <w:kern w:val="0"/>
+          <w:lang w:eastAsia="pt-PT"/>
+          <w14:ligatures w14:val="none"/>
+        </w:rPr>
+        <w:t xml:space="preserve"> para permitir tráfego ICMP, DNS (porta 53), HTTP/HTTPS (portas 80 e 443) e SSH. Finalmente, a comunicação da rede interna isolada para a Internet foi garantida através da configuração de </w:t>
+      </w:r>
+      <w:proofErr w:type="spellStart"/>
+      <w:r>
+        <w:rPr>
+          <w:rFonts w:ascii="Times New Roman" w:eastAsia="Times New Roman" w:hAnsi="Times New Roman" w:cs="Times New Roman"/>
+          <w:i/>
+          <w:iCs/>
+          <w:kern w:val="0"/>
+          <w:lang w:eastAsia="pt-PT"/>
+          <w14:ligatures w14:val="none"/>
+        </w:rPr>
+        <w:t>Source</w:t>
+      </w:r>
+      <w:proofErr w:type="spellEnd"/>
+      <w:r>
+        <w:rPr>
+          <w:rFonts w:ascii="Times New Roman" w:eastAsia="Times New Roman" w:hAnsi="Times New Roman" w:cs="Times New Roman"/>
+          <w:i/>
+          <w:iCs/>
+          <w:kern w:val="0"/>
+          <w:lang w:eastAsia="pt-PT"/>
+          <w14:ligatures w14:val="none"/>
+        </w:rPr>
+        <w:t xml:space="preserve"> NAT</w:t>
+      </w:r>
+      <w:r>
+        <w:rPr>
+          <w:rFonts w:ascii="Times New Roman" w:eastAsia="Times New Roman" w:hAnsi="Times New Roman" w:cs="Times New Roman"/>
+          <w:kern w:val="0"/>
+          <w:lang w:eastAsia="pt-PT"/>
+          <w14:ligatures w14:val="none"/>
+        </w:rPr>
+        <w:t xml:space="preserve"> (</w:t>
+      </w:r>
+      <w:proofErr w:type="spellStart"/>
+      <w:r>
+        <w:rPr>
+          <w:rFonts w:ascii="Times New Roman" w:eastAsia="Times New Roman" w:hAnsi="Times New Roman" w:cs="Times New Roman"/>
+          <w:kern w:val="0"/>
+          <w:lang w:eastAsia="pt-PT"/>
+          <w14:ligatures w14:val="none"/>
+        </w:rPr>
+        <w:t>Masquerade</w:t>
+      </w:r>
+      <w:proofErr w:type="spellEnd"/>
+      <w:r>
+        <w:rPr>
+          <w:rFonts w:ascii="Times New Roman" w:eastAsia="Times New Roman" w:hAnsi="Times New Roman" w:cs="Times New Roman"/>
+          <w:kern w:val="0"/>
+          <w:lang w:eastAsia="pt-PT"/>
+          <w14:ligatures w14:val="none"/>
+        </w:rPr>
+        <w:t xml:space="preserve">) na </w:t>
+      </w:r>
+      <w:proofErr w:type="spellStart"/>
+      <w:r>
+        <w:rPr>
+          <w:rFonts w:ascii="Times New Roman" w:eastAsia="Times New Roman" w:hAnsi="Times New Roman" w:cs="Times New Roman"/>
+          <w:i/>
+          <w:iCs/>
+          <w:kern w:val="0"/>
+          <w:lang w:eastAsia="pt-PT"/>
+          <w14:ligatures w14:val="none"/>
+        </w:rPr>
+        <w:t>chain</w:t>
+      </w:r>
+      <w:proofErr w:type="spellEnd"/>
+      <w:r>
+        <w:rPr>
+          <w:rFonts w:ascii="Times New Roman" w:eastAsia="Times New Roman" w:hAnsi="Times New Roman" w:cs="Times New Roman"/>
+          <w:kern w:val="0"/>
+          <w:lang w:eastAsia="pt-PT"/>
+          <w14:ligatures w14:val="none"/>
+        </w:rPr>
+        <w:t xml:space="preserve"> </w:t>
+      </w:r>
+      <w:r>
+        <w:rPr>
+          <w:rFonts w:ascii="Courier New" w:eastAsia="Times New Roman" w:hAnsi="Courier New" w:cs="Courier New"/>
+          <w:kern w:val="0"/>
+          <w:sz w:val="20"/>
+          <w:szCs w:val="20"/>
+          <w:lang w:eastAsia="pt-PT"/>
+          <w14:ligatures w14:val="none"/>
+        </w:rPr>
+        <w:t>POSTROUTING</w:t>
+      </w:r>
+      <w:r>
+        <w:rPr>
+          <w:rFonts w:ascii="Times New Roman" w:eastAsia="Times New Roman" w:hAnsi="Times New Roman" w:cs="Times New Roman"/>
+          <w:kern w:val="0"/>
+          <w:lang w:eastAsia="pt-PT"/>
+          <w14:ligatures w14:val="none"/>
+        </w:rPr>
+        <w:t>, mascarando os endereços privados com o IP público da interface externa do Router.</w:t>
+      </w:r>
+    </w:p>
+    <w:p>
+      <w:pPr>
+        <w:spacing w:before="100" w:beforeAutospacing="1" w:after="100" w:afterAutospacing="1" w:line="240" w:lineRule="auto"/>
+        <w:rPr>
+          <w:rFonts w:ascii="Times New Roman" w:eastAsia="Times New Roman" w:hAnsi="Times New Roman" w:cs="Times New Roman"/>
+          <w:kern w:val="0"/>
+          <w:lang w:eastAsia="pt-PT"/>
+          <w14:ligatures w14:val="none"/>
+        </w:rPr>
+      </w:pPr>
+      <w:r>
+        <w:rPr>
+          <w:rFonts w:ascii="Times New Roman" w:eastAsia="Times New Roman" w:hAnsi="Times New Roman" w:cs="Times New Roman"/>
+          <w:kern w:val="0"/>
+          <w:lang w:eastAsia="pt-PT"/>
+          <w14:ligatures w14:val="none"/>
+        </w:rPr>
+        <w:t xml:space="preserve">Para dotar a rede de capacidades avançadas de deteção e prevenção de intrusões, optámos por instalar o Suricata (versão 8.0.4) compilando-o diretamente a partir do código-fonte. Esta abordagem, preferível à utilização de repositórios standard, garantiu a inclusão do suporte nativo para interceção de pacotes. O processo exigiu a ativação do repositório CRB do </w:t>
+      </w:r>
+      <w:proofErr w:type="spellStart"/>
+      <w:r>
+        <w:rPr>
+          <w:rFonts w:ascii="Times New Roman" w:eastAsia="Times New Roman" w:hAnsi="Times New Roman" w:cs="Times New Roman"/>
+          <w:kern w:val="0"/>
+          <w:lang w:eastAsia="pt-PT"/>
+          <w14:ligatures w14:val="none"/>
+        </w:rPr>
+        <w:t>CentOS</w:t>
+      </w:r>
+      <w:proofErr w:type="spellEnd"/>
+      <w:r>
+        <w:rPr>
+          <w:rFonts w:ascii="Times New Roman" w:eastAsia="Times New Roman" w:hAnsi="Times New Roman" w:cs="Times New Roman"/>
+          <w:kern w:val="0"/>
+          <w:lang w:eastAsia="pt-PT"/>
+          <w14:ligatures w14:val="none"/>
+        </w:rPr>
+        <w:t xml:space="preserve"> e a instalação de um vasto leque de compiladores e dependências de desenvolvimento, como o </w:t>
+      </w:r>
+      <w:proofErr w:type="spellStart"/>
+      <w:r>
+        <w:rPr>
+          <w:rFonts w:ascii="Times New Roman" w:eastAsia="Times New Roman" w:hAnsi="Times New Roman" w:cs="Times New Roman"/>
+          <w:kern w:val="0"/>
+          <w:lang w:eastAsia="pt-PT"/>
+          <w14:ligatures w14:val="none"/>
+        </w:rPr>
+        <w:t>Rust</w:t>
+      </w:r>
+      <w:proofErr w:type="spellEnd"/>
+      <w:r>
+        <w:rPr>
+          <w:rFonts w:ascii="Times New Roman" w:eastAsia="Times New Roman" w:hAnsi="Times New Roman" w:cs="Times New Roman"/>
+          <w:kern w:val="0"/>
+          <w:lang w:eastAsia="pt-PT"/>
+          <w14:ligatures w14:val="none"/>
+        </w:rPr>
+        <w:t xml:space="preserve">, Cargo e as bibliotecas </w:t>
+      </w:r>
+      <w:proofErr w:type="spellStart"/>
+      <w:r>
+        <w:rPr>
+          <w:rFonts w:ascii="Courier New" w:eastAsia="Times New Roman" w:hAnsi="Courier New" w:cs="Courier New"/>
+          <w:kern w:val="0"/>
+          <w:sz w:val="20"/>
+          <w:szCs w:val="20"/>
+          <w:lang w:eastAsia="pt-PT"/>
+          <w14:ligatures w14:val="none"/>
+        </w:rPr>
+        <w:t>libnetfilter_queue-devel</w:t>
+      </w:r>
+      <w:proofErr w:type="spellEnd"/>
+      <w:r>
+        <w:rPr>
+          <w:rFonts w:ascii="Times New Roman" w:eastAsia="Times New Roman" w:hAnsi="Times New Roman" w:cs="Times New Roman"/>
+          <w:kern w:val="0"/>
+          <w:lang w:eastAsia="pt-PT"/>
+          <w14:ligatures w14:val="none"/>
+        </w:rPr>
+        <w:t xml:space="preserve">. A compilação foi executada com a </w:t>
+      </w:r>
+      <w:proofErr w:type="spellStart"/>
+      <w:r>
+        <w:rPr>
+          <w:rFonts w:ascii="Times New Roman" w:eastAsia="Times New Roman" w:hAnsi="Times New Roman" w:cs="Times New Roman"/>
+          <w:kern w:val="0"/>
+          <w:lang w:eastAsia="pt-PT"/>
+          <w14:ligatures w14:val="none"/>
+        </w:rPr>
+        <w:t>flag</w:t>
+      </w:r>
+      <w:proofErr w:type="spellEnd"/>
+      <w:r>
+        <w:rPr>
+          <w:rFonts w:ascii="Times New Roman" w:eastAsia="Times New Roman" w:hAnsi="Times New Roman" w:cs="Times New Roman"/>
+          <w:kern w:val="0"/>
+          <w:lang w:eastAsia="pt-PT"/>
+          <w14:ligatures w14:val="none"/>
+        </w:rPr>
+        <w:t xml:space="preserve"> explícita </w:t>
+      </w:r>
+      <w:r>
+        <w:rPr>
+          <w:rFonts w:ascii="Courier New" w:eastAsia="Times New Roman" w:hAnsi="Courier New" w:cs="Courier New"/>
+          <w:kern w:val="0"/>
+          <w:sz w:val="20"/>
+          <w:szCs w:val="20"/>
+          <w:lang w:eastAsia="pt-PT"/>
+          <w14:ligatures w14:val="none"/>
+        </w:rPr>
+        <w:t>--</w:t>
+      </w:r>
+      <w:proofErr w:type="spellStart"/>
+      <w:r>
+        <w:rPr>
+          <w:rFonts w:ascii="Courier New" w:eastAsia="Times New Roman" w:hAnsi="Courier New" w:cs="Courier New"/>
+          <w:kern w:val="0"/>
+          <w:sz w:val="20"/>
+          <w:szCs w:val="20"/>
+          <w:lang w:eastAsia="pt-PT"/>
+          <w14:ligatures w14:val="none"/>
+        </w:rPr>
+        <w:t>enable-nfqueue</w:t>
+      </w:r>
+      <w:proofErr w:type="spellEnd"/>
+      <w:r>
+        <w:rPr>
+          <w:rFonts w:ascii="Times New Roman" w:eastAsia="Times New Roman" w:hAnsi="Times New Roman" w:cs="Times New Roman"/>
+          <w:kern w:val="0"/>
+          <w:lang w:eastAsia="pt-PT"/>
+          <w14:ligatures w14:val="none"/>
+        </w:rPr>
+        <w:t xml:space="preserve">, essencial para que o Suricata opere no modo IPS </w:t>
+      </w:r>
+      <w:proofErr w:type="spellStart"/>
+      <w:r>
+        <w:rPr>
+          <w:rFonts w:ascii="Times New Roman" w:eastAsia="Times New Roman" w:hAnsi="Times New Roman" w:cs="Times New Roman"/>
+          <w:i/>
+          <w:iCs/>
+          <w:kern w:val="0"/>
+          <w:lang w:eastAsia="pt-PT"/>
+          <w14:ligatures w14:val="none"/>
+        </w:rPr>
+        <w:t>in-line</w:t>
+      </w:r>
+      <w:proofErr w:type="spellEnd"/>
+      <w:r>
+        <w:rPr>
+          <w:rFonts w:ascii="Times New Roman" w:eastAsia="Times New Roman" w:hAnsi="Times New Roman" w:cs="Times New Roman"/>
+          <w:kern w:val="0"/>
+          <w:lang w:eastAsia="pt-PT"/>
+          <w14:ligatures w14:val="none"/>
+        </w:rPr>
+        <w:t xml:space="preserve">. A integração desta ferramenta com a Firewall </w:t>
+      </w:r>
+      <w:proofErr w:type="spellStart"/>
+      <w:r>
+        <w:rPr>
+          <w:rFonts w:ascii="Times New Roman" w:eastAsia="Times New Roman" w:hAnsi="Times New Roman" w:cs="Times New Roman"/>
+          <w:kern w:val="0"/>
+          <w:lang w:eastAsia="pt-PT"/>
+          <w14:ligatures w14:val="none"/>
+        </w:rPr>
+        <w:t>IPTables</w:t>
+      </w:r>
+      <w:proofErr w:type="spellEnd"/>
+      <w:r>
+        <w:rPr>
+          <w:rFonts w:ascii="Times New Roman" w:eastAsia="Times New Roman" w:hAnsi="Times New Roman" w:cs="Times New Roman"/>
+          <w:kern w:val="0"/>
+          <w:lang w:eastAsia="pt-PT"/>
+          <w14:ligatures w14:val="none"/>
+        </w:rPr>
+        <w:t xml:space="preserve"> foi feita através da criação de uma </w:t>
+      </w:r>
+      <w:proofErr w:type="spellStart"/>
+      <w:r>
+        <w:rPr>
+          <w:rFonts w:ascii="Times New Roman" w:eastAsia="Times New Roman" w:hAnsi="Times New Roman" w:cs="Times New Roman"/>
+          <w:i/>
+          <w:iCs/>
+          <w:kern w:val="0"/>
+          <w:lang w:eastAsia="pt-PT"/>
+          <w14:ligatures w14:val="none"/>
+        </w:rPr>
+        <w:t>chain</w:t>
+      </w:r>
+      <w:proofErr w:type="spellEnd"/>
+      <w:r>
+        <w:rPr>
+          <w:rFonts w:ascii="Times New Roman" w:eastAsia="Times New Roman" w:hAnsi="Times New Roman" w:cs="Times New Roman"/>
+          <w:kern w:val="0"/>
+          <w:lang w:eastAsia="pt-PT"/>
+          <w14:ligatures w14:val="none"/>
+        </w:rPr>
+        <w:t xml:space="preserve"> dedicada (</w:t>
+      </w:r>
+      <w:r>
+        <w:rPr>
+          <w:rFonts w:ascii="Courier New" w:eastAsia="Times New Roman" w:hAnsi="Courier New" w:cs="Courier New"/>
+          <w:kern w:val="0"/>
+          <w:sz w:val="20"/>
+          <w:szCs w:val="20"/>
+          <w:lang w:eastAsia="pt-PT"/>
+          <w14:ligatures w14:val="none"/>
+        </w:rPr>
+        <w:t>SURICATA_INSPECT</w:t>
+      </w:r>
+      <w:r>
+        <w:rPr>
+          <w:rFonts w:ascii="Times New Roman" w:eastAsia="Times New Roman" w:hAnsi="Times New Roman" w:cs="Times New Roman"/>
+          <w:kern w:val="0"/>
+          <w:lang w:eastAsia="pt-PT"/>
+          <w14:ligatures w14:val="none"/>
+        </w:rPr>
+        <w:t>). Ao inserir uma regra logo no topo do roteamento (</w:t>
+      </w:r>
+      <w:proofErr w:type="spellStart"/>
+      <w:r>
+        <w:rPr>
+          <w:rFonts w:ascii="Courier New" w:eastAsia="Times New Roman" w:hAnsi="Courier New" w:cs="Courier New"/>
+          <w:kern w:val="0"/>
+          <w:sz w:val="20"/>
+          <w:szCs w:val="20"/>
+          <w:lang w:eastAsia="pt-PT"/>
+          <w14:ligatures w14:val="none"/>
+        </w:rPr>
+        <w:t>iptables</w:t>
+      </w:r>
+      <w:proofErr w:type="spellEnd"/>
+      <w:r>
+        <w:rPr>
+          <w:rFonts w:ascii="Courier New" w:eastAsia="Times New Roman" w:hAnsi="Courier New" w:cs="Courier New"/>
+          <w:kern w:val="0"/>
+          <w:sz w:val="20"/>
+          <w:szCs w:val="20"/>
+          <w:lang w:eastAsia="pt-PT"/>
+          <w14:ligatures w14:val="none"/>
+        </w:rPr>
+        <w:t xml:space="preserve"> -I FORWARD 1</w:t>
+      </w:r>
+      <w:r>
+        <w:rPr>
+          <w:rFonts w:ascii="Times New Roman" w:eastAsia="Times New Roman" w:hAnsi="Times New Roman" w:cs="Times New Roman"/>
+          <w:kern w:val="0"/>
+          <w:lang w:eastAsia="pt-PT"/>
+          <w14:ligatures w14:val="none"/>
+        </w:rPr>
+        <w:t xml:space="preserve">), garantimos que todo o tráfego é obrigatoriamente redirecionado para a fila zero do </w:t>
+      </w:r>
+      <w:proofErr w:type="spellStart"/>
+      <w:r>
+        <w:rPr>
+          <w:rFonts w:ascii="Times New Roman" w:eastAsia="Times New Roman" w:hAnsi="Times New Roman" w:cs="Times New Roman"/>
+          <w:i/>
+          <w:iCs/>
+          <w:kern w:val="0"/>
+          <w:lang w:eastAsia="pt-PT"/>
+          <w14:ligatures w14:val="none"/>
+        </w:rPr>
+        <w:t>kernel</w:t>
+      </w:r>
+      <w:proofErr w:type="spellEnd"/>
+      <w:r>
+        <w:rPr>
+          <w:rFonts w:ascii="Times New Roman" w:eastAsia="Times New Roman" w:hAnsi="Times New Roman" w:cs="Times New Roman"/>
+          <w:kern w:val="0"/>
+          <w:lang w:eastAsia="pt-PT"/>
+          <w14:ligatures w14:val="none"/>
+        </w:rPr>
+        <w:t xml:space="preserve"> (</w:t>
+      </w:r>
+      <w:r>
+        <w:rPr>
+          <w:rFonts w:ascii="Courier New" w:eastAsia="Times New Roman" w:hAnsi="Courier New" w:cs="Courier New"/>
+          <w:kern w:val="0"/>
+          <w:sz w:val="20"/>
+          <w:szCs w:val="20"/>
+          <w:lang w:eastAsia="pt-PT"/>
+          <w14:ligatures w14:val="none"/>
+        </w:rPr>
+        <w:t>NFQUEUE num 0</w:t>
+      </w:r>
+      <w:r>
+        <w:rPr>
+          <w:rFonts w:ascii="Times New Roman" w:eastAsia="Times New Roman" w:hAnsi="Times New Roman" w:cs="Times New Roman"/>
+          <w:kern w:val="0"/>
+          <w:lang w:eastAsia="pt-PT"/>
+          <w14:ligatures w14:val="none"/>
+        </w:rPr>
+        <w:t>). Desta forma, o Suricata atua como uma barreira de inspeção profunda antes de a firewall permitir ou negar definitivamente o seguimento do pacote.</w:t>
+      </w:r>
+    </w:p>
+    <w:p>
+      <w:pPr>
+        <w:spacing w:before="100" w:beforeAutospacing="1" w:after="100" w:afterAutospacing="1" w:line="240" w:lineRule="auto"/>
+        <w:outlineLvl w:val="1"/>
+        <w:rPr>
+          <w:rFonts w:ascii="Times New Roman" w:eastAsia="Times New Roman" w:hAnsi="Times New Roman" w:cs="Times New Roman"/>
+          <w:b/>
+          <w:bCs/>
+          <w:kern w:val="0"/>
+          <w:sz w:val="36"/>
+          <w:szCs w:val="36"/>
+          <w:lang w:eastAsia="pt-PT"/>
+          <w14:ligatures w14:val="none"/>
+        </w:rPr>
+      </w:pPr>
+    </w:p>
+    <w:p>
+      <w:pPr>
+        <w:spacing w:before="100" w:beforeAutospacing="1" w:after="100" w:afterAutospacing="1" w:line="240" w:lineRule="auto"/>
+        <w:outlineLvl w:val="1"/>
+        <w:rPr>
+          <w:rFonts w:ascii="Times New Roman" w:eastAsia="Times New Roman" w:hAnsi="Times New Roman" w:cs="Times New Roman"/>
+          <w:b/>
+          <w:bCs/>
+          <w:kern w:val="0"/>
+          <w:sz w:val="36"/>
+          <w:szCs w:val="36"/>
+          <w:lang w:eastAsia="pt-PT"/>
+          <w14:ligatures w14:val="none"/>
+        </w:rPr>
+      </w:pPr>
+    </w:p>
+    <w:p>
+      <w:pPr>
+        <w:spacing w:before="100" w:beforeAutospacing="1" w:after="100" w:afterAutospacing="1" w:line="240" w:lineRule="auto"/>
+        <w:outlineLvl w:val="1"/>
+        <w:rPr>
+          <w:rFonts w:ascii="Times New Roman" w:eastAsia="Times New Roman" w:hAnsi="Times New Roman" w:cs="Times New Roman"/>
+          <w:b/>
+          <w:bCs/>
+          <w:kern w:val="0"/>
+          <w:sz w:val="36"/>
+          <w:szCs w:val="36"/>
+          <w:lang w:eastAsia="pt-PT"/>
+          <w14:ligatures w14:val="none"/>
+        </w:rPr>
+      </w:pPr>
+      <w:r>
+        <w:rPr>
+          <w:rFonts w:ascii="Times New Roman" w:eastAsia="Times New Roman" w:hAnsi="Times New Roman" w:cs="Times New Roman"/>
+          <w:b/>
+          <w:bCs/>
+          <w:kern w:val="0"/>
+          <w:sz w:val="36"/>
+          <w:szCs w:val="36"/>
+          <w:lang w:eastAsia="pt-PT"/>
+          <w14:ligatures w14:val="none"/>
+        </w:rPr>
+        <w:lastRenderedPageBreak/>
+        <w:t>2. Descrição dos Testes Realizados para Validação</w:t>
+      </w:r>
+    </w:p>
+    <w:p>
+      <w:pPr>
+        <w:spacing w:before="100" w:beforeAutospacing="1" w:after="100" w:afterAutospacing="1" w:line="240" w:lineRule="auto"/>
+        <w:rPr>
+          <w:rFonts w:ascii="Times New Roman" w:eastAsia="Times New Roman" w:hAnsi="Times New Roman" w:cs="Times New Roman"/>
+          <w:kern w:val="0"/>
+          <w:lang w:eastAsia="pt-PT"/>
+          <w14:ligatures w14:val="none"/>
+        </w:rPr>
+      </w:pPr>
+      <w:r>
+        <w:rPr>
+          <w:rFonts w:ascii="Times New Roman" w:eastAsia="Times New Roman" w:hAnsi="Times New Roman" w:cs="Times New Roman"/>
+          <w:kern w:val="0"/>
+          <w:lang w:eastAsia="pt-PT"/>
+          <w14:ligatures w14:val="none"/>
+        </w:rPr>
+        <w:t xml:space="preserve">A validação de toda a infraestrutura construída foi realizada através de testes práticos sequenciais, assegurando o funcionamento rigoroso das restrições e permissões impostas. Inicialmente, testámos a política restritiva de base executando comandos </w:t>
+      </w:r>
+      <w:proofErr w:type="spellStart"/>
+      <w:r>
+        <w:rPr>
+          <w:rFonts w:ascii="Courier New" w:eastAsia="Times New Roman" w:hAnsi="Courier New" w:cs="Courier New"/>
+          <w:kern w:val="0"/>
+          <w:sz w:val="20"/>
+          <w:szCs w:val="20"/>
+          <w:lang w:eastAsia="pt-PT"/>
+          <w14:ligatures w14:val="none"/>
+        </w:rPr>
+        <w:t>ping</w:t>
+      </w:r>
+      <w:proofErr w:type="spellEnd"/>
+      <w:r>
+        <w:rPr>
+          <w:rFonts w:ascii="Times New Roman" w:eastAsia="Times New Roman" w:hAnsi="Times New Roman" w:cs="Times New Roman"/>
+          <w:kern w:val="0"/>
+          <w:lang w:eastAsia="pt-PT"/>
+          <w14:ligatures w14:val="none"/>
+        </w:rPr>
+        <w:t xml:space="preserve"> para o Router sem que existisse uma regra prévia a autorizar pacotes ICMP; o resultado foi 100% de </w:t>
+      </w:r>
+      <w:proofErr w:type="spellStart"/>
+      <w:r>
+        <w:rPr>
+          <w:rFonts w:ascii="Times New Roman" w:eastAsia="Times New Roman" w:hAnsi="Times New Roman" w:cs="Times New Roman"/>
+          <w:i/>
+          <w:iCs/>
+          <w:kern w:val="0"/>
+          <w:lang w:eastAsia="pt-PT"/>
+          <w14:ligatures w14:val="none"/>
+        </w:rPr>
+        <w:t>packet</w:t>
+      </w:r>
+      <w:proofErr w:type="spellEnd"/>
+      <w:r>
+        <w:rPr>
+          <w:rFonts w:ascii="Times New Roman" w:eastAsia="Times New Roman" w:hAnsi="Times New Roman" w:cs="Times New Roman"/>
+          <w:i/>
+          <w:iCs/>
+          <w:kern w:val="0"/>
+          <w:lang w:eastAsia="pt-PT"/>
+          <w14:ligatures w14:val="none"/>
+        </w:rPr>
+        <w:t xml:space="preserve"> </w:t>
+      </w:r>
+      <w:proofErr w:type="spellStart"/>
+      <w:r>
+        <w:rPr>
+          <w:rFonts w:ascii="Times New Roman" w:eastAsia="Times New Roman" w:hAnsi="Times New Roman" w:cs="Times New Roman"/>
+          <w:i/>
+          <w:iCs/>
+          <w:kern w:val="0"/>
+          <w:lang w:eastAsia="pt-PT"/>
+          <w14:ligatures w14:val="none"/>
+        </w:rPr>
+        <w:t>loss</w:t>
+      </w:r>
+      <w:proofErr w:type="spellEnd"/>
+      <w:r>
+        <w:rPr>
+          <w:rFonts w:ascii="Times New Roman" w:eastAsia="Times New Roman" w:hAnsi="Times New Roman" w:cs="Times New Roman"/>
+          <w:kern w:val="0"/>
+          <w:lang w:eastAsia="pt-PT"/>
+          <w14:ligatures w14:val="none"/>
+        </w:rPr>
+        <w:t xml:space="preserve">, validando o sucesso do bloqueio por defeito imposto pelo </w:t>
+      </w:r>
+      <w:proofErr w:type="spellStart"/>
+      <w:r>
+        <w:rPr>
+          <w:rFonts w:ascii="Times New Roman" w:eastAsia="Times New Roman" w:hAnsi="Times New Roman" w:cs="Times New Roman"/>
+          <w:kern w:val="0"/>
+          <w:lang w:eastAsia="pt-PT"/>
+          <w14:ligatures w14:val="none"/>
+        </w:rPr>
+        <w:t>IPTables</w:t>
+      </w:r>
+      <w:proofErr w:type="spellEnd"/>
+      <w:r>
+        <w:rPr>
+          <w:rFonts w:ascii="Times New Roman" w:eastAsia="Times New Roman" w:hAnsi="Times New Roman" w:cs="Times New Roman"/>
+          <w:kern w:val="0"/>
+          <w:lang w:eastAsia="pt-PT"/>
+          <w14:ligatures w14:val="none"/>
+        </w:rPr>
+        <w:t>.</w:t>
+      </w:r>
+    </w:p>
+    <w:p>
+      <w:pPr>
+        <w:spacing w:before="100" w:beforeAutospacing="1" w:after="100" w:afterAutospacing="1" w:line="240" w:lineRule="auto"/>
+        <w:rPr>
+          <w:rFonts w:ascii="Times New Roman" w:eastAsia="Times New Roman" w:hAnsi="Times New Roman" w:cs="Times New Roman"/>
+          <w:kern w:val="0"/>
+          <w:lang w:eastAsia="pt-PT"/>
+          <w14:ligatures w14:val="none"/>
+        </w:rPr>
+      </w:pPr>
+      <w:r>
+        <w:rPr>
+          <w:rFonts w:ascii="Times New Roman" w:eastAsia="Times New Roman" w:hAnsi="Times New Roman" w:cs="Times New Roman"/>
+          <w:kern w:val="0"/>
+          <w:lang w:eastAsia="pt-PT"/>
+          <w14:ligatures w14:val="none"/>
+        </w:rPr>
+        <w:t>Seguidamente, procedemos à validação das regras de roteamento interno (</w:t>
+      </w:r>
+      <w:r>
+        <w:rPr>
+          <w:rFonts w:ascii="Courier New" w:eastAsia="Times New Roman" w:hAnsi="Courier New" w:cs="Courier New"/>
+          <w:kern w:val="0"/>
+          <w:sz w:val="20"/>
+          <w:szCs w:val="20"/>
+          <w:lang w:eastAsia="pt-PT"/>
+          <w14:ligatures w14:val="none"/>
+        </w:rPr>
+        <w:t>FORWARD</w:t>
+      </w:r>
+      <w:r>
+        <w:rPr>
+          <w:rFonts w:ascii="Times New Roman" w:eastAsia="Times New Roman" w:hAnsi="Times New Roman" w:cs="Times New Roman"/>
+          <w:kern w:val="0"/>
+          <w:lang w:eastAsia="pt-PT"/>
+          <w14:ligatures w14:val="none"/>
+        </w:rPr>
+        <w:t xml:space="preserve">). Utilizando a ferramenta </w:t>
+      </w:r>
+      <w:proofErr w:type="spellStart"/>
+      <w:r>
+        <w:rPr>
+          <w:rFonts w:ascii="Times New Roman" w:eastAsia="Times New Roman" w:hAnsi="Times New Roman" w:cs="Times New Roman"/>
+          <w:kern w:val="0"/>
+          <w:lang w:eastAsia="pt-PT"/>
+          <w14:ligatures w14:val="none"/>
+        </w:rPr>
+        <w:t>Netcat</w:t>
+      </w:r>
+      <w:proofErr w:type="spellEnd"/>
+      <w:r>
+        <w:rPr>
+          <w:rFonts w:ascii="Times New Roman" w:eastAsia="Times New Roman" w:hAnsi="Times New Roman" w:cs="Times New Roman"/>
+          <w:kern w:val="0"/>
+          <w:lang w:eastAsia="pt-PT"/>
+          <w14:ligatures w14:val="none"/>
+        </w:rPr>
+        <w:t xml:space="preserve"> (</w:t>
+      </w:r>
+      <w:proofErr w:type="spellStart"/>
+      <w:r>
+        <w:rPr>
+          <w:rFonts w:ascii="Courier New" w:eastAsia="Times New Roman" w:hAnsi="Courier New" w:cs="Courier New"/>
+          <w:kern w:val="0"/>
+          <w:sz w:val="20"/>
+          <w:szCs w:val="20"/>
+          <w:lang w:eastAsia="pt-PT"/>
+          <w14:ligatures w14:val="none"/>
+        </w:rPr>
+        <w:t>nc</w:t>
+      </w:r>
+      <w:proofErr w:type="spellEnd"/>
+      <w:r>
+        <w:rPr>
+          <w:rFonts w:ascii="Times New Roman" w:eastAsia="Times New Roman" w:hAnsi="Times New Roman" w:cs="Times New Roman"/>
+          <w:kern w:val="0"/>
+          <w:lang w:eastAsia="pt-PT"/>
+          <w14:ligatures w14:val="none"/>
+        </w:rPr>
+        <w:t>), simulámos um serviço web na porta 80 dentro da rede interna e tentámos aceder-lhe a partir da máquina vizinha. Após diagnosticarmos que a falha inicial de conexão (</w:t>
+      </w:r>
+      <w:r>
+        <w:rPr>
+          <w:rFonts w:ascii="Courier New" w:eastAsia="Times New Roman" w:hAnsi="Courier New" w:cs="Courier New"/>
+          <w:kern w:val="0"/>
+          <w:sz w:val="20"/>
+          <w:szCs w:val="20"/>
+          <w:lang w:eastAsia="pt-PT"/>
+          <w14:ligatures w14:val="none"/>
+        </w:rPr>
+        <w:t xml:space="preserve">No </w:t>
+      </w:r>
+      <w:proofErr w:type="spellStart"/>
+      <w:r>
+        <w:rPr>
+          <w:rFonts w:ascii="Courier New" w:eastAsia="Times New Roman" w:hAnsi="Courier New" w:cs="Courier New"/>
+          <w:kern w:val="0"/>
+          <w:sz w:val="20"/>
+          <w:szCs w:val="20"/>
+          <w:lang w:eastAsia="pt-PT"/>
+          <w14:ligatures w14:val="none"/>
+        </w:rPr>
+        <w:t>route</w:t>
+      </w:r>
+      <w:proofErr w:type="spellEnd"/>
+      <w:r>
+        <w:rPr>
+          <w:rFonts w:ascii="Courier New" w:eastAsia="Times New Roman" w:hAnsi="Courier New" w:cs="Courier New"/>
+          <w:kern w:val="0"/>
+          <w:sz w:val="20"/>
+          <w:szCs w:val="20"/>
+          <w:lang w:eastAsia="pt-PT"/>
+          <w14:ligatures w14:val="none"/>
+        </w:rPr>
+        <w:t xml:space="preserve"> to </w:t>
+      </w:r>
+      <w:proofErr w:type="spellStart"/>
+      <w:r>
+        <w:rPr>
+          <w:rFonts w:ascii="Courier New" w:eastAsia="Times New Roman" w:hAnsi="Courier New" w:cs="Courier New"/>
+          <w:kern w:val="0"/>
+          <w:sz w:val="20"/>
+          <w:szCs w:val="20"/>
+          <w:lang w:eastAsia="pt-PT"/>
+          <w14:ligatures w14:val="none"/>
+        </w:rPr>
+        <w:t>host</w:t>
+      </w:r>
+      <w:proofErr w:type="spellEnd"/>
+      <w:r>
+        <w:rPr>
+          <w:rFonts w:ascii="Times New Roman" w:eastAsia="Times New Roman" w:hAnsi="Times New Roman" w:cs="Times New Roman"/>
+          <w:kern w:val="0"/>
+          <w:lang w:eastAsia="pt-PT"/>
+          <w14:ligatures w14:val="none"/>
+        </w:rPr>
+        <w:t xml:space="preserve">) era causada pelas </w:t>
+      </w:r>
+      <w:proofErr w:type="spellStart"/>
+      <w:r>
+        <w:rPr>
+          <w:rFonts w:ascii="Times New Roman" w:eastAsia="Times New Roman" w:hAnsi="Times New Roman" w:cs="Times New Roman"/>
+          <w:kern w:val="0"/>
+          <w:lang w:eastAsia="pt-PT"/>
+          <w14:ligatures w14:val="none"/>
+        </w:rPr>
+        <w:t>firewalls</w:t>
+      </w:r>
+      <w:proofErr w:type="spellEnd"/>
+      <w:r>
+        <w:rPr>
+          <w:rFonts w:ascii="Times New Roman" w:eastAsia="Times New Roman" w:hAnsi="Times New Roman" w:cs="Times New Roman"/>
+          <w:kern w:val="0"/>
+          <w:lang w:eastAsia="pt-PT"/>
+          <w14:ligatures w14:val="none"/>
+        </w:rPr>
+        <w:t xml:space="preserve"> locais ativas de fábrica nos clientes </w:t>
+      </w:r>
+      <w:proofErr w:type="spellStart"/>
+      <w:r>
+        <w:rPr>
+          <w:rFonts w:ascii="Times New Roman" w:eastAsia="Times New Roman" w:hAnsi="Times New Roman" w:cs="Times New Roman"/>
+          <w:kern w:val="0"/>
+          <w:lang w:eastAsia="pt-PT"/>
+          <w14:ligatures w14:val="none"/>
+        </w:rPr>
+        <w:t>CentOS</w:t>
+      </w:r>
+      <w:proofErr w:type="spellEnd"/>
+      <w:r>
+        <w:rPr>
+          <w:rFonts w:ascii="Times New Roman" w:eastAsia="Times New Roman" w:hAnsi="Times New Roman" w:cs="Times New Roman"/>
+          <w:kern w:val="0"/>
+          <w:lang w:eastAsia="pt-PT"/>
+          <w14:ligatures w14:val="none"/>
+        </w:rPr>
+        <w:t xml:space="preserve"> (</w:t>
+      </w:r>
+      <w:proofErr w:type="spellStart"/>
+      <w:r>
+        <w:rPr>
+          <w:rFonts w:ascii="Courier New" w:eastAsia="Times New Roman" w:hAnsi="Courier New" w:cs="Courier New"/>
+          <w:kern w:val="0"/>
+          <w:sz w:val="20"/>
+          <w:szCs w:val="20"/>
+          <w:lang w:eastAsia="pt-PT"/>
+          <w14:ligatures w14:val="none"/>
+        </w:rPr>
+        <w:t>firewalld</w:t>
+      </w:r>
+      <w:proofErr w:type="spellEnd"/>
+      <w:r>
+        <w:rPr>
+          <w:rFonts w:ascii="Times New Roman" w:eastAsia="Times New Roman" w:hAnsi="Times New Roman" w:cs="Times New Roman"/>
+          <w:kern w:val="0"/>
+          <w:lang w:eastAsia="pt-PT"/>
+          <w14:ligatures w14:val="none"/>
+        </w:rPr>
+        <w:t xml:space="preserve">), desativámos as mesmas para centrar a segurança em exclusivo no Router. Após este ajuste, o tráfego </w:t>
+      </w:r>
+      <w:proofErr w:type="spellStart"/>
+      <w:r>
+        <w:rPr>
+          <w:rFonts w:ascii="Times New Roman" w:eastAsia="Times New Roman" w:hAnsi="Times New Roman" w:cs="Times New Roman"/>
+          <w:kern w:val="0"/>
+          <w:lang w:eastAsia="pt-PT"/>
+          <w14:ligatures w14:val="none"/>
+        </w:rPr>
+        <w:t>Netcat</w:t>
+      </w:r>
+      <w:proofErr w:type="spellEnd"/>
+      <w:r>
+        <w:rPr>
+          <w:rFonts w:ascii="Times New Roman" w:eastAsia="Times New Roman" w:hAnsi="Times New Roman" w:cs="Times New Roman"/>
+          <w:kern w:val="0"/>
+          <w:lang w:eastAsia="pt-PT"/>
+          <w14:ligatures w14:val="none"/>
+        </w:rPr>
+        <w:t xml:space="preserve"> fluiu com a mensagem de sucesso esperado, provando o correto reencaminhamento de portas autorizadas pela firewall. O funcionamento do NAT de saída foi também validado mediante </w:t>
+      </w:r>
+      <w:proofErr w:type="spellStart"/>
+      <w:r>
+        <w:rPr>
+          <w:rFonts w:ascii="Times New Roman" w:eastAsia="Times New Roman" w:hAnsi="Times New Roman" w:cs="Times New Roman"/>
+          <w:kern w:val="0"/>
+          <w:lang w:eastAsia="pt-PT"/>
+          <w14:ligatures w14:val="none"/>
+        </w:rPr>
+        <w:t>pings</w:t>
+      </w:r>
+      <w:proofErr w:type="spellEnd"/>
+      <w:r>
+        <w:rPr>
+          <w:rFonts w:ascii="Times New Roman" w:eastAsia="Times New Roman" w:hAnsi="Times New Roman" w:cs="Times New Roman"/>
+          <w:kern w:val="0"/>
+          <w:lang w:eastAsia="pt-PT"/>
+          <w14:ligatures w14:val="none"/>
+        </w:rPr>
+        <w:t xml:space="preserve"> da máquina na rede 10.10.10.0/24 para endereços externos públicos (como o 8.8.8.8), os quais obtiveram resposta imediata, confirmando a tradução de endereços.</w:t>
+      </w:r>
+    </w:p>
+    <w:p>
+      <w:pPr>
+        <w:spacing w:before="100" w:beforeAutospacing="1" w:after="100" w:afterAutospacing="1" w:line="240" w:lineRule="auto"/>
+        <w:rPr>
+          <w:rFonts w:ascii="Times New Roman" w:eastAsia="Times New Roman" w:hAnsi="Times New Roman" w:cs="Times New Roman"/>
+          <w:kern w:val="0"/>
+          <w:lang w:eastAsia="pt-PT"/>
+          <w14:ligatures w14:val="none"/>
+        </w:rPr>
+      </w:pPr>
+      <w:r>
+        <w:rPr>
+          <w:rFonts w:ascii="Times New Roman" w:eastAsia="Times New Roman" w:hAnsi="Times New Roman" w:cs="Times New Roman"/>
+          <w:kern w:val="0"/>
+          <w:lang w:eastAsia="pt-PT"/>
+          <w14:ligatures w14:val="none"/>
+        </w:rPr>
+        <w:t xml:space="preserve">Por fim, realizámos o teste crítico à capacidade IPS da rede. Este ensaio consistiu em manter uma comunicação contínua para o exterior enquanto o serviço do Suricata era manipulado manualmente no terminal do Router. Constatou-se que, com o processo do Suricata desligado, os pacotes gerados pela máquina cliente ficavam integralmente retidos na </w:t>
+      </w:r>
+      <w:r>
+        <w:rPr>
+          <w:rFonts w:ascii="Courier New" w:eastAsia="Times New Roman" w:hAnsi="Courier New" w:cs="Courier New"/>
+          <w:kern w:val="0"/>
+          <w:sz w:val="20"/>
+          <w:szCs w:val="20"/>
+          <w:lang w:eastAsia="pt-PT"/>
+          <w14:ligatures w14:val="none"/>
+        </w:rPr>
+        <w:t>NFQUEUE</w:t>
+      </w:r>
+      <w:r>
+        <w:rPr>
+          <w:rFonts w:ascii="Times New Roman" w:eastAsia="Times New Roman" w:hAnsi="Times New Roman" w:cs="Times New Roman"/>
+          <w:kern w:val="0"/>
+          <w:lang w:eastAsia="pt-PT"/>
+          <w14:ligatures w14:val="none"/>
+        </w:rPr>
+        <w:t>, resultando na interrupção total da Internet. Assim que o motor do Suricata foi iniciado (</w:t>
+      </w:r>
+      <w:r>
+        <w:rPr>
+          <w:rFonts w:ascii="Courier New" w:eastAsia="Times New Roman" w:hAnsi="Courier New" w:cs="Courier New"/>
+          <w:kern w:val="0"/>
+          <w:sz w:val="20"/>
+          <w:szCs w:val="20"/>
+          <w:lang w:eastAsia="pt-PT"/>
+          <w14:ligatures w14:val="none"/>
+        </w:rPr>
+        <w:t>suricata -q 0</w:t>
+      </w:r>
+      <w:r>
+        <w:rPr>
+          <w:rFonts w:ascii="Times New Roman" w:eastAsia="Times New Roman" w:hAnsi="Times New Roman" w:cs="Times New Roman"/>
+          <w:kern w:val="0"/>
+          <w:lang w:eastAsia="pt-PT"/>
+          <w14:ligatures w14:val="none"/>
+        </w:rPr>
+        <w:t xml:space="preserve">), o processamento da fila foi retomado e a comunicação voltou a fluir em tempo real. Este comportamento provou de forma inequívoca que o </w:t>
+      </w:r>
+      <w:proofErr w:type="spellStart"/>
+      <w:r>
+        <w:rPr>
+          <w:rFonts w:ascii="Times New Roman" w:eastAsia="Times New Roman" w:hAnsi="Times New Roman" w:cs="Times New Roman"/>
+          <w:kern w:val="0"/>
+          <w:lang w:eastAsia="pt-PT"/>
+          <w14:ligatures w14:val="none"/>
+        </w:rPr>
+        <w:t>IPTables</w:t>
+      </w:r>
+      <w:proofErr w:type="spellEnd"/>
+      <w:r>
+        <w:rPr>
+          <w:rFonts w:ascii="Times New Roman" w:eastAsia="Times New Roman" w:hAnsi="Times New Roman" w:cs="Times New Roman"/>
+          <w:kern w:val="0"/>
+          <w:lang w:eastAsia="pt-PT"/>
+          <w14:ligatures w14:val="none"/>
+        </w:rPr>
+        <w:t xml:space="preserve"> e o Suricata estão interligados num verdadeiro sistema de Prevenção de Intrusões (IPS), estando o tráfego da rede totalmente condicionado ao veredicto de segurança do Suricata.</w:t>
+      </w:r>
     </w:p>
     <w:p>
       <w:pPr>
@@ -649,7 +2334,6 @@
     <w:next w:val="Normal"/>
     <w:link w:val="Heading2Char"/>
     <w:uiPriority w:val="9"/>
-    <w:semiHidden/>
     <w:unhideWhenUsed/>
     <w:qFormat/>
     <w:rsid w:val="000D18F6"/>
@@ -866,7 +2550,6 @@
     <w:basedOn w:val="DefaultParagraphFont"/>
     <w:link w:val="Heading2"/>
     <w:uiPriority w:val="9"/>
-    <w:semiHidden/>
     <w:rsid w:val="000D18F6"/>
     <w:rPr>
       <w:rFonts w:asciiTheme="majorHAnsi" w:eastAsiaTheme="majorEastAsia" w:hAnsiTheme="majorHAnsi" w:cstheme="majorBidi"/>
@@ -1151,6 +2834,36 @@
       <w:rFonts w:ascii="Baskerville Old Face" w:hAnsi="Baskerville Old Face" w:cs="Baskerville Old Face"/>
       <w:color w:val="000000"/>
       <w:kern w:val="0"/>
+    </w:rPr>
+  </w:style>
+  <w:style w:type="paragraph" w:styleId="NormalWeb">
+    <w:name w:val="Normal (Web)"/>
+    <w:basedOn w:val="Normal"/>
+    <w:uiPriority w:val="99"/>
+    <w:semiHidden/>
+    <w:unhideWhenUsed/>
+    <w:rsid w:val="0069594C"/>
+    <w:pPr>
+      <w:spacing w:before="100" w:beforeAutospacing="1" w:after="100" w:afterAutospacing="1" w:line="240" w:lineRule="auto"/>
+    </w:pPr>
+    <w:rPr>
+      <w:rFonts w:ascii="Times New Roman" w:eastAsia="Times New Roman" w:hAnsi="Times New Roman" w:cs="Times New Roman"/>
+      <w:kern w:val="0"/>
+      <w:lang w:eastAsia="pt-PT"/>
+      <w14:ligatures w14:val="none"/>
+    </w:rPr>
+  </w:style>
+  <w:style w:type="character" w:styleId="HTMLCode">
+    <w:name w:val="HTML Code"/>
+    <w:basedOn w:val="DefaultParagraphFont"/>
+    <w:uiPriority w:val="99"/>
+    <w:semiHidden/>
+    <w:unhideWhenUsed/>
+    <w:rsid w:val="0069594C"/>
+    <w:rPr>
+      <w:rFonts w:ascii="Courier New" w:eastAsia="Times New Roman" w:hAnsi="Courier New" w:cs="Courier New"/>
+      <w:sz w:val="20"/>
+      <w:szCs w:val="20"/>
     </w:rPr>
   </w:style>
 </w:styles>

</xml_diff>